<commit_message>
added unit tests to check the validity
</commit_message>
<xml_diff>
--- a/Project 1 Basics of Python/wallet_app/Wallet App Project Documentation.docx
+++ b/Project 1 Basics of Python/wallet_app/Wallet App Project Documentation.docx
@@ -257,6 +257,7 @@
     <w:p>
       <w:pPr>
         <w:numPr>
+          <w:ilvl w:val="0"/>
           <w:numId w:val="0"/>
         </w:numPr>
         <w:spacing w:line="360" w:lineRule="auto"/>
@@ -402,6 +403,7 @@
     <w:p>
       <w:pPr>
         <w:numPr>
+          <w:ilvl w:val="0"/>
           <w:numId w:val="0"/>
         </w:numPr>
         <w:spacing w:line="360" w:lineRule="auto"/>
@@ -591,6 +593,7 @@
     <w:p>
       <w:pPr>
         <w:numPr>
+          <w:ilvl w:val="0"/>
           <w:numId w:val="0"/>
         </w:numPr>
         <w:spacing w:line="360" w:lineRule="auto"/>
@@ -773,1054 +776,282 @@
           <w:szCs w:val="22"/>
           <w:lang w:val="en-US"/>
         </w:rPr>
-        <w:t xml:space="preserve"> Ability to transfer betwe</w:t>
-      </w:r>
+        <w:t xml:space="preserve"> Ability to transfer between different banks</w:t>
+      </w:r>
+    </w:p>
+    <w:p>
+      <w:pPr>
+        <w:numPr>
+          <w:ilvl w:val="0"/>
+          <w:numId w:val="5"/>
+        </w:numPr>
+        <w:spacing w:line="360" w:lineRule="auto"/>
+        <w:jc w:val="both"/>
+        <w:rPr>
+          <w:rFonts w:hint="default" w:ascii="Times New Roman" w:hAnsi="Times New Roman" w:cs="Times New Roman"/>
+          <w:b/>
+          <w:bCs/>
+          <w:sz w:val="22"/>
+          <w:szCs w:val="22"/>
+          <w:lang w:val="en-US"/>
+        </w:rPr>
+      </w:pPr>
+      <w:r>
+        <w:rPr>
+          <w:rFonts w:hint="default" w:ascii="Times New Roman" w:hAnsi="Times New Roman" w:cs="Times New Roman"/>
+          <w:b/>
+          <w:bCs/>
+          <w:sz w:val="22"/>
+          <w:szCs w:val="22"/>
+          <w:lang w:val="en-US"/>
+        </w:rPr>
+        <w:t>SETUP AND RUN GUIDE</w:t>
+      </w:r>
+    </w:p>
+    <w:p>
+      <w:pPr>
+        <w:numPr>
+          <w:ilvl w:val="0"/>
+          <w:numId w:val="6"/>
+        </w:numPr>
+        <w:spacing w:line="360" w:lineRule="auto"/>
+        <w:ind w:left="425" w:leftChars="0" w:hanging="425" w:firstLineChars="0"/>
+        <w:jc w:val="both"/>
+        <w:rPr>
+          <w:rFonts w:hint="default" w:ascii="Times New Roman" w:hAnsi="Times New Roman" w:cs="Times New Roman"/>
+          <w:sz w:val="22"/>
+          <w:szCs w:val="22"/>
+          <w:lang w:val="en-US"/>
+        </w:rPr>
+      </w:pPr>
+      <w:r>
+        <w:rPr>
+          <w:rFonts w:hint="default" w:ascii="Times New Roman" w:hAnsi="Times New Roman" w:cs="Times New Roman"/>
+          <w:b/>
+          <w:bCs/>
+          <w:sz w:val="22"/>
+          <w:szCs w:val="22"/>
+          <w:lang w:val="en-US"/>
+        </w:rPr>
+        <w:t>Run:</w:t>
+      </w:r>
+      <w:r>
+        <w:rPr>
+          <w:rFonts w:hint="default" w:ascii="Times New Roman" w:hAnsi="Times New Roman" w:cs="Times New Roman"/>
+          <w:sz w:val="22"/>
+          <w:szCs w:val="22"/>
+          <w:lang w:val="en-US"/>
+        </w:rPr>
+        <w:t xml:space="preserve"> Execute python wallet_app.py.</w:t>
+      </w:r>
+    </w:p>
+    <w:p>
+      <w:pPr>
+        <w:numPr>
+          <w:ilvl w:val="0"/>
+          <w:numId w:val="6"/>
+        </w:numPr>
+        <w:spacing w:line="360" w:lineRule="auto"/>
+        <w:ind w:left="425" w:leftChars="0" w:hanging="425" w:firstLineChars="0"/>
+        <w:jc w:val="both"/>
+        <w:rPr>
+          <w:rFonts w:hint="default" w:ascii="Times New Roman" w:hAnsi="Times New Roman" w:cs="Times New Roman"/>
+          <w:sz w:val="22"/>
+          <w:szCs w:val="22"/>
+          <w:lang w:val="en-US"/>
+        </w:rPr>
+      </w:pPr>
+      <w:r>
+        <w:rPr>
+          <w:rFonts w:hint="default" w:ascii="Times New Roman" w:hAnsi="Times New Roman" w:cs="Times New Roman"/>
+          <w:b/>
+          <w:bCs/>
+          <w:sz w:val="22"/>
+          <w:szCs w:val="22"/>
+          <w:lang w:val="en-US"/>
+        </w:rPr>
+        <w:t>Register:</w:t>
+      </w:r>
+      <w:r>
+        <w:rPr>
+          <w:rFonts w:hint="default" w:ascii="Times New Roman" w:hAnsi="Times New Roman" w:cs="Times New Roman"/>
+          <w:sz w:val="22"/>
+          <w:szCs w:val="22"/>
+          <w:lang w:val="en-US"/>
+        </w:rPr>
+        <w:t xml:space="preserve"> Enter a name and phone number and click "Register."</w:t>
+      </w:r>
+    </w:p>
+    <w:p>
+      <w:pPr>
+        <w:numPr>
+          <w:ilvl w:val="0"/>
+          <w:numId w:val="6"/>
+        </w:numPr>
+        <w:spacing w:line="360" w:lineRule="auto"/>
+        <w:ind w:left="425" w:leftChars="0" w:hanging="425" w:firstLineChars="0"/>
+        <w:jc w:val="both"/>
+        <w:rPr>
+          <w:rFonts w:hint="default" w:ascii="Times New Roman" w:hAnsi="Times New Roman" w:cs="Times New Roman"/>
+          <w:sz w:val="22"/>
+          <w:szCs w:val="22"/>
+          <w:lang w:val="en-US"/>
+        </w:rPr>
+      </w:pPr>
+      <w:r>
+        <w:rPr>
+          <w:rFonts w:hint="default" w:ascii="Times New Roman" w:hAnsi="Times New Roman" w:cs="Times New Roman"/>
+          <w:b/>
+          <w:bCs/>
+          <w:sz w:val="22"/>
+          <w:szCs w:val="22"/>
+          <w:lang w:val="en-US"/>
+        </w:rPr>
+        <w:t>Login:</w:t>
+      </w:r>
+      <w:r>
+        <w:rPr>
+          <w:rFonts w:hint="default" w:ascii="Times New Roman" w:hAnsi="Times New Roman" w:cs="Times New Roman"/>
+          <w:sz w:val="22"/>
+          <w:szCs w:val="22"/>
+          <w:lang w:val="en-US"/>
+        </w:rPr>
+        <w:t xml:space="preserve"> Enter the phone number and click "Login."</w:t>
+      </w:r>
+    </w:p>
+    <w:p>
+      <w:pPr>
+        <w:numPr>
+          <w:ilvl w:val="0"/>
+          <w:numId w:val="6"/>
+        </w:numPr>
+        <w:spacing w:line="360" w:lineRule="auto"/>
+        <w:ind w:left="425" w:leftChars="0" w:hanging="425" w:firstLineChars="0"/>
+        <w:jc w:val="both"/>
+        <w:rPr>
+          <w:rFonts w:hint="default" w:ascii="Times New Roman" w:hAnsi="Times New Roman" w:cs="Times New Roman"/>
+          <w:sz w:val="22"/>
+          <w:szCs w:val="22"/>
+          <w:lang w:val="en-US"/>
+        </w:rPr>
+      </w:pPr>
+      <w:r>
+        <w:rPr>
+          <w:rFonts w:hint="default" w:ascii="Times New Roman" w:hAnsi="Times New Roman" w:cs="Times New Roman"/>
+          <w:b/>
+          <w:bCs/>
+          <w:sz w:val="22"/>
+          <w:szCs w:val="22"/>
+          <w:lang w:val="en-US"/>
+        </w:rPr>
+        <w:t>Transfer:</w:t>
+      </w:r>
+      <w:r>
+        <w:rPr>
+          <w:rFonts w:hint="default" w:ascii="Times New Roman" w:hAnsi="Times New Roman" w:cs="Times New Roman"/>
+          <w:sz w:val="22"/>
+          <w:szCs w:val="22"/>
+          <w:lang w:val="en-US"/>
+        </w:rPr>
+        <w:t xml:space="preserve"> Open a second instance of the app or register another user to have a receiver phone number to send money to.</w:t>
+      </w:r>
+    </w:p>
+    <w:p>
+      <w:pPr>
+        <w:numPr>
+          <w:numId w:val="0"/>
+        </w:numPr>
+        <w:tabs>
+          <w:tab w:val="left" w:pos="425"/>
+        </w:tabs>
+        <w:spacing w:line="360" w:lineRule="auto"/>
+        <w:jc w:val="both"/>
+        <w:rPr>
+          <w:rFonts w:hint="default" w:ascii="Times New Roman" w:hAnsi="Times New Roman" w:cs="Times New Roman"/>
+          <w:sz w:val="22"/>
+          <w:szCs w:val="22"/>
+          <w:lang w:val="en-US"/>
+        </w:rPr>
+      </w:pPr>
+    </w:p>
+    <w:p>
+      <w:pPr>
+        <w:numPr>
+          <w:numId w:val="0"/>
+        </w:numPr>
+        <w:tabs>
+          <w:tab w:val="left" w:pos="425"/>
+        </w:tabs>
+        <w:spacing w:line="360" w:lineRule="auto"/>
+        <w:jc w:val="both"/>
+        <w:rPr>
+          <w:rFonts w:hint="default" w:ascii="Times New Roman" w:hAnsi="Times New Roman" w:cs="Times New Roman"/>
+          <w:sz w:val="22"/>
+          <w:szCs w:val="22"/>
+          <w:lang w:val="en-US"/>
+        </w:rPr>
+      </w:pPr>
       <w:bookmarkStart w:id="0" w:name="_GoBack"/>
       <w:bookmarkEnd w:id="0"/>
-      <w:r>
-        <w:rPr>
-          <w:rFonts w:hint="default" w:ascii="Times New Roman" w:hAnsi="Times New Roman" w:cs="Times New Roman"/>
-          <w:sz w:val="22"/>
-          <w:szCs w:val="22"/>
-          <w:lang w:val="en-US"/>
-        </w:rPr>
-        <w:t>en different banks</w:t>
-      </w:r>
-    </w:p>
-    <w:p>
-      <w:pPr>
-        <w:numPr>
-          <w:ilvl w:val="0"/>
-          <w:numId w:val="5"/>
-        </w:numPr>
-        <w:spacing w:line="360" w:lineRule="auto"/>
-        <w:jc w:val="both"/>
-        <w:rPr>
-          <w:rFonts w:hint="default" w:ascii="Times New Roman" w:hAnsi="Times New Roman" w:cs="Times New Roman"/>
-          <w:b/>
-          <w:bCs/>
-          <w:sz w:val="22"/>
-          <w:szCs w:val="22"/>
-          <w:lang w:val="en-US"/>
-        </w:rPr>
-      </w:pPr>
-      <w:r>
-        <w:rPr>
-          <w:rFonts w:hint="default" w:ascii="Times New Roman" w:hAnsi="Times New Roman" w:cs="Times New Roman"/>
-          <w:b/>
-          <w:bCs/>
-          <w:sz w:val="22"/>
-          <w:szCs w:val="22"/>
-          <w:lang w:val="en-US"/>
-        </w:rPr>
-        <w:t>SETUP AND RUN GUIDE</w:t>
-      </w:r>
-    </w:p>
-    <w:p>
-      <w:pPr>
-        <w:numPr>
-          <w:ilvl w:val="0"/>
-          <w:numId w:val="6"/>
-        </w:numPr>
-        <w:spacing w:line="360" w:lineRule="auto"/>
-        <w:ind w:left="425" w:leftChars="0" w:hanging="425" w:firstLineChars="0"/>
-        <w:jc w:val="both"/>
-        <w:rPr>
-          <w:rFonts w:hint="default" w:ascii="Times New Roman" w:hAnsi="Times New Roman" w:cs="Times New Roman"/>
-          <w:sz w:val="22"/>
-          <w:szCs w:val="22"/>
-          <w:lang w:val="en-US"/>
-        </w:rPr>
-      </w:pPr>
-      <w:r>
-        <w:rPr>
-          <w:rFonts w:hint="default" w:ascii="Times New Roman" w:hAnsi="Times New Roman" w:cs="Times New Roman"/>
-          <w:b/>
-          <w:bCs/>
-          <w:sz w:val="22"/>
-          <w:szCs w:val="22"/>
-          <w:lang w:val="en-US"/>
-        </w:rPr>
-        <w:t>Run:</w:t>
-      </w:r>
-      <w:r>
-        <w:rPr>
-          <w:rFonts w:hint="default" w:ascii="Times New Roman" w:hAnsi="Times New Roman" w:cs="Times New Roman"/>
-          <w:sz w:val="22"/>
-          <w:szCs w:val="22"/>
-          <w:lang w:val="en-US"/>
-        </w:rPr>
-        <w:t xml:space="preserve"> Execute python wallet_app.py.</w:t>
-      </w:r>
-    </w:p>
-    <w:p>
-      <w:pPr>
-        <w:numPr>
-          <w:ilvl w:val="0"/>
-          <w:numId w:val="6"/>
-        </w:numPr>
-        <w:spacing w:line="360" w:lineRule="auto"/>
-        <w:ind w:left="425" w:leftChars="0" w:hanging="425" w:firstLineChars="0"/>
-        <w:jc w:val="both"/>
-        <w:rPr>
-          <w:rFonts w:hint="default" w:ascii="Times New Roman" w:hAnsi="Times New Roman" w:cs="Times New Roman"/>
-          <w:sz w:val="22"/>
-          <w:szCs w:val="22"/>
-          <w:lang w:val="en-US"/>
-        </w:rPr>
-      </w:pPr>
-      <w:r>
-        <w:rPr>
-          <w:rFonts w:hint="default" w:ascii="Times New Roman" w:hAnsi="Times New Roman" w:cs="Times New Roman"/>
-          <w:b/>
-          <w:bCs/>
-          <w:sz w:val="22"/>
-          <w:szCs w:val="22"/>
-          <w:lang w:val="en-US"/>
-        </w:rPr>
-        <w:t>Register:</w:t>
-      </w:r>
-      <w:r>
-        <w:rPr>
-          <w:rFonts w:hint="default" w:ascii="Times New Roman" w:hAnsi="Times New Roman" w:cs="Times New Roman"/>
-          <w:sz w:val="22"/>
-          <w:szCs w:val="22"/>
-          <w:lang w:val="en-US"/>
-        </w:rPr>
-        <w:t xml:space="preserve"> Enter a name and phone number and click "Register."</w:t>
-      </w:r>
-    </w:p>
-    <w:p>
-      <w:pPr>
-        <w:numPr>
-          <w:ilvl w:val="0"/>
-          <w:numId w:val="6"/>
-        </w:numPr>
-        <w:spacing w:line="360" w:lineRule="auto"/>
-        <w:ind w:left="425" w:leftChars="0" w:hanging="425" w:firstLineChars="0"/>
-        <w:jc w:val="both"/>
-        <w:rPr>
-          <w:rFonts w:hint="default" w:ascii="Times New Roman" w:hAnsi="Times New Roman" w:cs="Times New Roman"/>
-          <w:sz w:val="22"/>
-          <w:szCs w:val="22"/>
-          <w:lang w:val="en-US"/>
-        </w:rPr>
-      </w:pPr>
-      <w:r>
-        <w:rPr>
-          <w:rFonts w:hint="default" w:ascii="Times New Roman" w:hAnsi="Times New Roman" w:cs="Times New Roman"/>
-          <w:b/>
-          <w:bCs/>
-          <w:sz w:val="22"/>
-          <w:szCs w:val="22"/>
-          <w:lang w:val="en-US"/>
-        </w:rPr>
-        <w:t>Login:</w:t>
-      </w:r>
-      <w:r>
-        <w:rPr>
-          <w:rFonts w:hint="default" w:ascii="Times New Roman" w:hAnsi="Times New Roman" w:cs="Times New Roman"/>
-          <w:sz w:val="22"/>
-          <w:szCs w:val="22"/>
-          <w:lang w:val="en-US"/>
-        </w:rPr>
-        <w:t xml:space="preserve"> Enter the phone number and click "Login."</w:t>
-      </w:r>
-    </w:p>
-    <w:p>
-      <w:pPr>
-        <w:numPr>
-          <w:ilvl w:val="0"/>
-          <w:numId w:val="6"/>
-        </w:numPr>
-        <w:spacing w:line="360" w:lineRule="auto"/>
-        <w:ind w:left="425" w:leftChars="0" w:hanging="425" w:firstLineChars="0"/>
-        <w:jc w:val="both"/>
-        <w:rPr>
-          <w:rFonts w:hint="default" w:ascii="Times New Roman" w:hAnsi="Times New Roman" w:cs="Times New Roman"/>
-          <w:sz w:val="22"/>
-          <w:szCs w:val="22"/>
-          <w:lang w:val="en-US"/>
-        </w:rPr>
-      </w:pPr>
-      <w:r>
-        <w:rPr>
-          <w:rFonts w:hint="default" w:ascii="Times New Roman" w:hAnsi="Times New Roman" w:cs="Times New Roman"/>
-          <w:b/>
-          <w:bCs/>
-          <w:sz w:val="22"/>
-          <w:szCs w:val="22"/>
-          <w:lang w:val="en-US"/>
-        </w:rPr>
-        <w:t>Transfer:</w:t>
-      </w:r>
-      <w:r>
-        <w:rPr>
-          <w:rFonts w:hint="default" w:ascii="Times New Roman" w:hAnsi="Times New Roman" w:cs="Times New Roman"/>
-          <w:sz w:val="22"/>
-          <w:szCs w:val="22"/>
-          <w:lang w:val="en-US"/>
-        </w:rPr>
-        <w:t xml:space="preserve"> Open a second instance of the app or register another user to have a receiver phone number to send money to.</w:t>
-      </w:r>
-    </w:p>
-    <w:p>
-      <w:pPr>
-        <w:numPr>
+    </w:p>
+    <w:p>
+      <w:pPr>
+        <w:numPr>
+          <w:ilvl w:val="0"/>
           <w:numId w:val="0"/>
         </w:numPr>
         <w:spacing w:line="360" w:lineRule="auto"/>
-        <w:ind w:leftChars="0"/>
-        <w:jc w:val="both"/>
-        <w:rPr>
-          <w:rFonts w:hint="default" w:ascii="Times New Roman" w:hAnsi="Times New Roman" w:cs="Times New Roman"/>
-          <w:sz w:val="22"/>
-          <w:szCs w:val="22"/>
-          <w:lang w:val="en-US"/>
-        </w:rPr>
-      </w:pPr>
-    </w:p>
-    <w:p>
-      <w:pPr>
-        <w:numPr>
-          <w:ilvl w:val="0"/>
-          <w:numId w:val="5"/>
-        </w:numPr>
-        <w:spacing w:line="360" w:lineRule="auto"/>
-        <w:ind w:left="0" w:leftChars="0" w:firstLine="0" w:firstLineChars="0"/>
-        <w:jc w:val="both"/>
-        <w:rPr>
-          <w:rFonts w:hint="default" w:ascii="Times New Roman" w:hAnsi="Times New Roman"/>
-          <w:b/>
-          <w:bCs/>
-          <w:sz w:val="22"/>
-          <w:szCs w:val="22"/>
-          <w:lang w:val="en-US"/>
-        </w:rPr>
-      </w:pPr>
-      <w:r>
-        <w:rPr>
-          <w:rFonts w:hint="default" w:ascii="Times New Roman" w:hAnsi="Times New Roman"/>
-          <w:b/>
-          <w:bCs/>
-          <w:sz w:val="22"/>
-          <w:szCs w:val="22"/>
-          <w:lang w:val="en-US"/>
-        </w:rPr>
-        <w:t>TESTING THE ETHIOPIAN PHONE FORMAT</w:t>
-      </w:r>
-    </w:p>
-    <w:p>
-      <w:pPr>
-        <w:numPr>
+        <w:jc w:val="both"/>
+        <w:rPr>
+          <w:rFonts w:hint="default" w:ascii="Times New Roman" w:hAnsi="Times New Roman" w:cs="Times New Roman"/>
+          <w:sz w:val="22"/>
+          <w:szCs w:val="22"/>
+          <w:lang w:val="en-US"/>
+        </w:rPr>
+      </w:pPr>
+    </w:p>
+    <w:p>
+      <w:pPr>
+        <w:numPr>
+          <w:ilvl w:val="0"/>
           <w:numId w:val="0"/>
         </w:numPr>
         <w:spacing w:line="360" w:lineRule="auto"/>
         <w:jc w:val="both"/>
         <w:rPr>
-          <w:rFonts w:hint="default" w:ascii="Times New Roman" w:hAnsi="Times New Roman"/>
-          <w:b/>
-          <w:bCs/>
-          <w:sz w:val="22"/>
-          <w:szCs w:val="22"/>
-          <w:lang w:val="en-US"/>
-        </w:rPr>
-      </w:pPr>
-    </w:p>
-    <w:tbl>
-      <w:tblPr>
-        <w:tblStyle w:val="4"/>
-        <w:tblW w:w="0" w:type="auto"/>
-        <w:tblInd w:w="0" w:type="dxa"/>
-        <w:tblBorders>
-          <w:top w:val="single" w:color="auto" w:sz="4" w:space="0"/>
-          <w:left w:val="single" w:color="auto" w:sz="4" w:space="0"/>
-          <w:bottom w:val="single" w:color="auto" w:sz="4" w:space="0"/>
-          <w:right w:val="single" w:color="auto" w:sz="4" w:space="0"/>
-          <w:insideH w:val="single" w:color="auto" w:sz="4" w:space="0"/>
-          <w:insideV w:val="single" w:color="auto" w:sz="4" w:space="0"/>
-        </w:tblBorders>
-        <w:tblLayout w:type="autofit"/>
-        <w:tblCellMar>
-          <w:left w:w="108" w:type="dxa"/>
-          <w:right w:w="108" w:type="dxa"/>
-        </w:tblCellMar>
-      </w:tblPr>
-      <w:tblGrid>
-        <w:gridCol w:w="1998"/>
-        <w:gridCol w:w="1544"/>
-        <w:gridCol w:w="4980"/>
-      </w:tblGrid>
-      <w:tr>
-        <w:tblPrEx>
-          <w:tblBorders>
-            <w:top w:val="single" w:color="auto" w:sz="4" w:space="0"/>
-            <w:left w:val="single" w:color="auto" w:sz="4" w:space="0"/>
-            <w:bottom w:val="single" w:color="auto" w:sz="4" w:space="0"/>
-            <w:right w:val="single" w:color="auto" w:sz="4" w:space="0"/>
-            <w:insideH w:val="single" w:color="auto" w:sz="4" w:space="0"/>
-            <w:insideV w:val="single" w:color="auto" w:sz="4" w:space="0"/>
-          </w:tblBorders>
-          <w:tblCellMar>
-            <w:left w:w="108" w:type="dxa"/>
-            <w:right w:w="108" w:type="dxa"/>
-          </w:tblCellMar>
-        </w:tblPrEx>
-        <w:tc>
-          <w:tcPr>
-            <w:tcW w:w="1998" w:type="dxa"/>
-          </w:tcPr>
-          <w:p>
-            <w:pPr>
-              <w:numPr>
-                <w:numId w:val="0"/>
-              </w:numPr>
-              <w:spacing w:line="360" w:lineRule="auto"/>
-              <w:jc w:val="both"/>
-              <w:rPr>
-                <w:rFonts w:hint="default" w:ascii="Times New Roman" w:hAnsi="Times New Roman"/>
-                <w:b/>
-                <w:bCs/>
-                <w:sz w:val="22"/>
-                <w:szCs w:val="22"/>
-                <w:vertAlign w:val="baseline"/>
-                <w:lang w:val="en-US"/>
-              </w:rPr>
-            </w:pPr>
-            <w:r>
-              <w:rPr>
-                <w:rFonts w:hint="default" w:ascii="Times New Roman" w:hAnsi="Times New Roman"/>
-                <w:b/>
-                <w:bCs/>
-                <w:sz w:val="22"/>
-                <w:szCs w:val="22"/>
-                <w:lang w:val="en-US"/>
-              </w:rPr>
-              <w:t>Input</w:t>
-            </w:r>
-          </w:p>
-        </w:tc>
-        <w:tc>
-          <w:tcPr>
-            <w:tcW w:w="1544" w:type="dxa"/>
-          </w:tcPr>
-          <w:p>
-            <w:pPr>
-              <w:numPr>
-                <w:numId w:val="0"/>
-              </w:numPr>
-              <w:spacing w:line="360" w:lineRule="auto"/>
-              <w:jc w:val="both"/>
-              <w:rPr>
-                <w:rFonts w:hint="default" w:ascii="Times New Roman" w:hAnsi="Times New Roman"/>
-                <w:b/>
-                <w:bCs/>
-                <w:sz w:val="22"/>
-                <w:szCs w:val="22"/>
-                <w:vertAlign w:val="baseline"/>
-                <w:lang w:val="en-US"/>
-              </w:rPr>
-            </w:pPr>
-            <w:r>
-              <w:rPr>
-                <w:rFonts w:hint="default" w:ascii="Times New Roman" w:hAnsi="Times New Roman"/>
-                <w:b/>
-                <w:bCs/>
-                <w:sz w:val="22"/>
-                <w:szCs w:val="22"/>
-                <w:lang w:val="en-US"/>
-              </w:rPr>
-              <w:t>Valid?</w:t>
-            </w:r>
-          </w:p>
-        </w:tc>
-        <w:tc>
-          <w:tcPr>
-            <w:tcW w:w="4980" w:type="dxa"/>
-          </w:tcPr>
-          <w:p>
-            <w:pPr>
-              <w:numPr>
-                <w:numId w:val="0"/>
-              </w:numPr>
-              <w:spacing w:line="360" w:lineRule="auto"/>
-              <w:jc w:val="both"/>
-              <w:rPr>
-                <w:rFonts w:hint="default" w:ascii="Times New Roman" w:hAnsi="Times New Roman"/>
-                <w:b/>
-                <w:bCs/>
-                <w:sz w:val="22"/>
-                <w:szCs w:val="22"/>
-                <w:vertAlign w:val="baseline"/>
-                <w:lang w:val="en-US"/>
-              </w:rPr>
-            </w:pPr>
-            <w:r>
-              <w:rPr>
-                <w:rFonts w:hint="default" w:ascii="Times New Roman" w:hAnsi="Times New Roman"/>
-                <w:b/>
-                <w:bCs/>
-                <w:sz w:val="22"/>
-                <w:szCs w:val="22"/>
-                <w:lang w:val="en-US"/>
-              </w:rPr>
-              <w:t>Reason</w:t>
-            </w:r>
-          </w:p>
-        </w:tc>
-      </w:tr>
-      <w:tr>
-        <w:tblPrEx>
-          <w:tblBorders>
-            <w:top w:val="single" w:color="auto" w:sz="4" w:space="0"/>
-            <w:left w:val="single" w:color="auto" w:sz="4" w:space="0"/>
-            <w:bottom w:val="single" w:color="auto" w:sz="4" w:space="0"/>
-            <w:right w:val="single" w:color="auto" w:sz="4" w:space="0"/>
-            <w:insideH w:val="single" w:color="auto" w:sz="4" w:space="0"/>
-            <w:insideV w:val="single" w:color="auto" w:sz="4" w:space="0"/>
-          </w:tblBorders>
-          <w:tblCellMar>
-            <w:left w:w="108" w:type="dxa"/>
-            <w:right w:w="108" w:type="dxa"/>
-          </w:tblCellMar>
-        </w:tblPrEx>
-        <w:tc>
-          <w:tcPr>
-            <w:tcW w:w="1998" w:type="dxa"/>
-          </w:tcPr>
-          <w:p>
-            <w:pPr>
-              <w:numPr>
-                <w:numId w:val="0"/>
-              </w:numPr>
-              <w:spacing w:line="360" w:lineRule="auto"/>
-              <w:jc w:val="both"/>
-              <w:rPr>
-                <w:rFonts w:hint="default" w:ascii="Times New Roman" w:hAnsi="Times New Roman"/>
-                <w:sz w:val="22"/>
-                <w:szCs w:val="22"/>
-                <w:vertAlign w:val="baseline"/>
-                <w:lang w:val="en-US"/>
-              </w:rPr>
-            </w:pPr>
-            <w:r>
-              <w:rPr>
-                <w:rFonts w:hint="default" w:ascii="Times New Roman" w:hAnsi="Times New Roman"/>
-                <w:sz w:val="22"/>
-                <w:szCs w:val="22"/>
-                <w:lang w:val="en-US"/>
-              </w:rPr>
-              <w:t>0911223344</w:t>
-            </w:r>
-          </w:p>
-        </w:tc>
-        <w:tc>
-          <w:tcPr>
-            <w:tcW w:w="1544" w:type="dxa"/>
-          </w:tcPr>
-          <w:p>
-            <w:pPr>
-              <w:numPr>
-                <w:numId w:val="0"/>
-              </w:numPr>
-              <w:spacing w:line="360" w:lineRule="auto"/>
-              <w:jc w:val="both"/>
-              <w:rPr>
-                <w:rFonts w:hint="default" w:ascii="Times New Roman" w:hAnsi="Times New Roman"/>
-                <w:sz w:val="22"/>
-                <w:szCs w:val="22"/>
-                <w:vertAlign w:val="baseline"/>
-                <w:lang w:val="en-US"/>
-              </w:rPr>
-            </w:pPr>
-            <w:r>
-              <w:rPr>
-                <w:rFonts w:hint="default" w:ascii="Times New Roman" w:hAnsi="Times New Roman"/>
-                <w:sz w:val="22"/>
-                <w:szCs w:val="22"/>
-                <w:lang w:val="en-US"/>
-              </w:rPr>
-              <w:t>Yes</w:t>
-            </w:r>
-          </w:p>
-        </w:tc>
-        <w:tc>
-          <w:tcPr>
-            <w:tcW w:w="4980" w:type="dxa"/>
-          </w:tcPr>
-          <w:p>
-            <w:pPr>
-              <w:numPr>
-                <w:ilvl w:val="0"/>
-                <w:numId w:val="0"/>
-              </w:numPr>
-              <w:spacing w:line="360" w:lineRule="auto"/>
-              <w:jc w:val="both"/>
-              <w:rPr>
-                <w:rFonts w:hint="default" w:ascii="Times New Roman" w:hAnsi="Times New Roman"/>
-                <w:sz w:val="22"/>
-                <w:szCs w:val="22"/>
-                <w:vertAlign w:val="baseline"/>
-                <w:lang w:val="en-US"/>
-              </w:rPr>
-            </w:pPr>
-            <w:r>
-              <w:rPr>
-                <w:rFonts w:hint="default" w:ascii="Times New Roman" w:hAnsi="Times New Roman"/>
-                <w:sz w:val="22"/>
-                <w:szCs w:val="22"/>
-                <w:lang w:val="en-US"/>
-              </w:rPr>
-              <w:t>Standard Ethio Telecom format (10 digits)</w:t>
-            </w:r>
-          </w:p>
-        </w:tc>
-      </w:tr>
-      <w:tr>
-        <w:tblPrEx>
-          <w:tblBorders>
-            <w:top w:val="single" w:color="auto" w:sz="4" w:space="0"/>
-            <w:left w:val="single" w:color="auto" w:sz="4" w:space="0"/>
-            <w:bottom w:val="single" w:color="auto" w:sz="4" w:space="0"/>
-            <w:right w:val="single" w:color="auto" w:sz="4" w:space="0"/>
-            <w:insideH w:val="single" w:color="auto" w:sz="4" w:space="0"/>
-            <w:insideV w:val="single" w:color="auto" w:sz="4" w:space="0"/>
-          </w:tblBorders>
-          <w:tblCellMar>
-            <w:left w:w="108" w:type="dxa"/>
-            <w:right w:w="108" w:type="dxa"/>
-          </w:tblCellMar>
-        </w:tblPrEx>
-        <w:tc>
-          <w:tcPr>
-            <w:tcW w:w="1998" w:type="dxa"/>
-          </w:tcPr>
-          <w:p>
-            <w:pPr>
-              <w:numPr>
-                <w:numId w:val="0"/>
-              </w:numPr>
-              <w:spacing w:line="360" w:lineRule="auto"/>
-              <w:jc w:val="both"/>
-              <w:rPr>
-                <w:rFonts w:hint="default" w:ascii="Times New Roman" w:hAnsi="Times New Roman"/>
-                <w:sz w:val="22"/>
-                <w:szCs w:val="22"/>
-                <w:vertAlign w:val="baseline"/>
-                <w:lang w:val="en-US"/>
-              </w:rPr>
-            </w:pPr>
-            <w:r>
-              <w:rPr>
-                <w:rFonts w:hint="default" w:ascii="Times New Roman" w:hAnsi="Times New Roman"/>
-                <w:sz w:val="22"/>
-                <w:szCs w:val="22"/>
-                <w:lang w:val="en-US"/>
-              </w:rPr>
-              <w:t>0711223344</w:t>
-            </w:r>
-          </w:p>
-        </w:tc>
-        <w:tc>
-          <w:tcPr>
-            <w:tcW w:w="1544" w:type="dxa"/>
-          </w:tcPr>
-          <w:p>
-            <w:pPr>
-              <w:numPr>
-                <w:numId w:val="0"/>
-              </w:numPr>
-              <w:spacing w:line="360" w:lineRule="auto"/>
-              <w:jc w:val="both"/>
-              <w:rPr>
-                <w:rFonts w:hint="default" w:ascii="Times New Roman" w:hAnsi="Times New Roman"/>
-                <w:sz w:val="22"/>
-                <w:szCs w:val="22"/>
-                <w:vertAlign w:val="baseline"/>
-                <w:lang w:val="en-US"/>
-              </w:rPr>
-            </w:pPr>
-            <w:r>
-              <w:rPr>
-                <w:rFonts w:hint="default" w:ascii="Times New Roman" w:hAnsi="Times New Roman"/>
-                <w:sz w:val="22"/>
-                <w:szCs w:val="22"/>
-                <w:lang w:val="en-US"/>
-              </w:rPr>
-              <w:t>Yes</w:t>
-            </w:r>
-          </w:p>
-        </w:tc>
-        <w:tc>
-          <w:tcPr>
-            <w:tcW w:w="4980" w:type="dxa"/>
-          </w:tcPr>
-          <w:p>
-            <w:pPr>
-              <w:numPr>
-                <w:ilvl w:val="0"/>
-                <w:numId w:val="0"/>
-              </w:numPr>
-              <w:spacing w:line="360" w:lineRule="auto"/>
-              <w:jc w:val="both"/>
-              <w:rPr>
-                <w:rFonts w:hint="default" w:ascii="Times New Roman" w:hAnsi="Times New Roman"/>
-                <w:sz w:val="22"/>
-                <w:szCs w:val="22"/>
-                <w:vertAlign w:val="baseline"/>
-                <w:lang w:val="en-US"/>
-              </w:rPr>
-            </w:pPr>
-            <w:r>
-              <w:rPr>
-                <w:rFonts w:hint="default" w:ascii="Times New Roman" w:hAnsi="Times New Roman"/>
-                <w:sz w:val="22"/>
-                <w:szCs w:val="22"/>
-                <w:lang w:val="en-US"/>
-              </w:rPr>
-              <w:t>Standard Safaricom Ethiopia format (10 digits)</w:t>
-            </w:r>
-          </w:p>
-        </w:tc>
-      </w:tr>
-      <w:tr>
-        <w:tblPrEx>
-          <w:tblBorders>
-            <w:top w:val="single" w:color="auto" w:sz="4" w:space="0"/>
-            <w:left w:val="single" w:color="auto" w:sz="4" w:space="0"/>
-            <w:bottom w:val="single" w:color="auto" w:sz="4" w:space="0"/>
-            <w:right w:val="single" w:color="auto" w:sz="4" w:space="0"/>
-            <w:insideH w:val="single" w:color="auto" w:sz="4" w:space="0"/>
-            <w:insideV w:val="single" w:color="auto" w:sz="4" w:space="0"/>
-          </w:tblBorders>
-          <w:tblCellMar>
-            <w:left w:w="108" w:type="dxa"/>
-            <w:right w:w="108" w:type="dxa"/>
-          </w:tblCellMar>
-        </w:tblPrEx>
-        <w:tc>
-          <w:tcPr>
-            <w:tcW w:w="1998" w:type="dxa"/>
-          </w:tcPr>
-          <w:p>
-            <w:pPr>
-              <w:numPr>
-                <w:numId w:val="0"/>
-              </w:numPr>
-              <w:spacing w:line="360" w:lineRule="auto"/>
-              <w:jc w:val="both"/>
-              <w:rPr>
-                <w:rFonts w:hint="default" w:ascii="Times New Roman" w:hAnsi="Times New Roman"/>
-                <w:sz w:val="22"/>
-                <w:szCs w:val="22"/>
-                <w:vertAlign w:val="baseline"/>
-                <w:lang w:val="en-US"/>
-              </w:rPr>
-            </w:pPr>
-            <w:r>
-              <w:rPr>
-                <w:rFonts w:hint="default" w:ascii="Times New Roman" w:hAnsi="Times New Roman"/>
-                <w:sz w:val="22"/>
-                <w:szCs w:val="22"/>
-                <w:lang w:val="en-US"/>
-              </w:rPr>
-              <w:t>+251911223344</w:t>
-            </w:r>
-          </w:p>
-        </w:tc>
-        <w:tc>
-          <w:tcPr>
-            <w:tcW w:w="1544" w:type="dxa"/>
-          </w:tcPr>
-          <w:p>
-            <w:pPr>
-              <w:numPr>
-                <w:numId w:val="0"/>
-              </w:numPr>
-              <w:spacing w:line="360" w:lineRule="auto"/>
-              <w:jc w:val="both"/>
-              <w:rPr>
-                <w:rFonts w:hint="default" w:ascii="Times New Roman" w:hAnsi="Times New Roman"/>
-                <w:sz w:val="22"/>
-                <w:szCs w:val="22"/>
-                <w:vertAlign w:val="baseline"/>
-                <w:lang w:val="en-US"/>
-              </w:rPr>
-            </w:pPr>
-            <w:r>
-              <w:rPr>
-                <w:rFonts w:hint="default" w:ascii="Times New Roman" w:hAnsi="Times New Roman"/>
-                <w:sz w:val="22"/>
-                <w:szCs w:val="22"/>
-                <w:lang w:val="en-US"/>
-              </w:rPr>
-              <w:t>Yes</w:t>
-            </w:r>
-          </w:p>
-        </w:tc>
-        <w:tc>
-          <w:tcPr>
-            <w:tcW w:w="4980" w:type="dxa"/>
-          </w:tcPr>
-          <w:p>
-            <w:pPr>
-              <w:numPr>
-                <w:ilvl w:val="0"/>
-                <w:numId w:val="0"/>
-              </w:numPr>
-              <w:spacing w:line="360" w:lineRule="auto"/>
-              <w:jc w:val="both"/>
-              <w:rPr>
-                <w:rFonts w:hint="default" w:ascii="Times New Roman" w:hAnsi="Times New Roman"/>
-                <w:sz w:val="22"/>
-                <w:szCs w:val="22"/>
-                <w:vertAlign w:val="baseline"/>
-                <w:lang w:val="en-US"/>
-              </w:rPr>
-            </w:pPr>
-            <w:r>
-              <w:rPr>
-                <w:rFonts w:hint="default" w:ascii="Times New Roman" w:hAnsi="Times New Roman"/>
-                <w:sz w:val="22"/>
-                <w:szCs w:val="22"/>
-                <w:lang w:val="en-US"/>
-              </w:rPr>
-              <w:t>International format</w:t>
-            </w:r>
-          </w:p>
-        </w:tc>
-      </w:tr>
-      <w:tr>
-        <w:tblPrEx>
-          <w:tblBorders>
-            <w:top w:val="single" w:color="auto" w:sz="4" w:space="0"/>
-            <w:left w:val="single" w:color="auto" w:sz="4" w:space="0"/>
-            <w:bottom w:val="single" w:color="auto" w:sz="4" w:space="0"/>
-            <w:right w:val="single" w:color="auto" w:sz="4" w:space="0"/>
-            <w:insideH w:val="single" w:color="auto" w:sz="4" w:space="0"/>
-            <w:insideV w:val="single" w:color="auto" w:sz="4" w:space="0"/>
-          </w:tblBorders>
-          <w:tblCellMar>
-            <w:left w:w="108" w:type="dxa"/>
-            <w:right w:w="108" w:type="dxa"/>
-          </w:tblCellMar>
-        </w:tblPrEx>
-        <w:tc>
-          <w:tcPr>
-            <w:tcW w:w="1998" w:type="dxa"/>
-          </w:tcPr>
-          <w:p>
-            <w:pPr>
-              <w:numPr>
-                <w:numId w:val="0"/>
-              </w:numPr>
-              <w:spacing w:line="360" w:lineRule="auto"/>
-              <w:jc w:val="both"/>
-              <w:rPr>
-                <w:rFonts w:hint="default" w:ascii="Times New Roman" w:hAnsi="Times New Roman"/>
-                <w:sz w:val="22"/>
-                <w:szCs w:val="22"/>
-                <w:vertAlign w:val="baseline"/>
-                <w:lang w:val="en-US"/>
-              </w:rPr>
-            </w:pPr>
-            <w:r>
-              <w:rPr>
-                <w:rFonts w:hint="default" w:ascii="Times New Roman" w:hAnsi="Times New Roman"/>
-                <w:sz w:val="22"/>
-                <w:szCs w:val="22"/>
-                <w:lang w:val="en-US"/>
-              </w:rPr>
-              <w:t>0811223344</w:t>
-            </w:r>
-          </w:p>
-        </w:tc>
-        <w:tc>
-          <w:tcPr>
-            <w:tcW w:w="1544" w:type="dxa"/>
-          </w:tcPr>
-          <w:p>
-            <w:pPr>
-              <w:numPr>
-                <w:numId w:val="0"/>
-              </w:numPr>
-              <w:spacing w:line="360" w:lineRule="auto"/>
-              <w:jc w:val="both"/>
-              <w:rPr>
-                <w:rFonts w:hint="default" w:ascii="Times New Roman" w:hAnsi="Times New Roman"/>
-                <w:sz w:val="22"/>
-                <w:szCs w:val="22"/>
-                <w:vertAlign w:val="baseline"/>
-                <w:lang w:val="en-US"/>
-              </w:rPr>
-            </w:pPr>
-            <w:r>
-              <w:rPr>
-                <w:rFonts w:hint="default" w:ascii="Times New Roman" w:hAnsi="Times New Roman"/>
-                <w:sz w:val="22"/>
-                <w:szCs w:val="22"/>
-                <w:lang w:val="en-US"/>
-              </w:rPr>
-              <w:t>No</w:t>
-            </w:r>
-          </w:p>
-        </w:tc>
-        <w:tc>
-          <w:tcPr>
-            <w:tcW w:w="4980" w:type="dxa"/>
-          </w:tcPr>
-          <w:p>
-            <w:pPr>
-              <w:numPr>
-                <w:numId w:val="0"/>
-              </w:numPr>
-              <w:spacing w:line="360" w:lineRule="auto"/>
-              <w:jc w:val="both"/>
-              <w:rPr>
-                <w:rFonts w:hint="default" w:ascii="Times New Roman" w:hAnsi="Times New Roman"/>
-                <w:sz w:val="22"/>
-                <w:szCs w:val="22"/>
-                <w:vertAlign w:val="baseline"/>
-                <w:lang w:val="en-US"/>
-              </w:rPr>
-            </w:pPr>
-            <w:r>
-              <w:rPr>
-                <w:rFonts w:hint="default" w:ascii="Times New Roman" w:hAnsi="Times New Roman"/>
-                <w:sz w:val="22"/>
-                <w:szCs w:val="22"/>
-                <w:lang w:val="en-US"/>
-              </w:rPr>
-              <w:t>Ethiopian numbers don't start with 08</w:t>
-            </w:r>
-          </w:p>
-        </w:tc>
-      </w:tr>
-      <w:tr>
-        <w:tblPrEx>
-          <w:tblBorders>
-            <w:top w:val="single" w:color="auto" w:sz="4" w:space="0"/>
-            <w:left w:val="single" w:color="auto" w:sz="4" w:space="0"/>
-            <w:bottom w:val="single" w:color="auto" w:sz="4" w:space="0"/>
-            <w:right w:val="single" w:color="auto" w:sz="4" w:space="0"/>
-            <w:insideH w:val="single" w:color="auto" w:sz="4" w:space="0"/>
-            <w:insideV w:val="single" w:color="auto" w:sz="4" w:space="0"/>
-          </w:tblBorders>
-          <w:tblCellMar>
-            <w:left w:w="108" w:type="dxa"/>
-            <w:right w:w="108" w:type="dxa"/>
-          </w:tblCellMar>
-        </w:tblPrEx>
-        <w:tc>
-          <w:tcPr>
-            <w:tcW w:w="1998" w:type="dxa"/>
-          </w:tcPr>
-          <w:p>
-            <w:pPr>
-              <w:numPr>
-                <w:numId w:val="0"/>
-              </w:numPr>
-              <w:spacing w:line="360" w:lineRule="auto"/>
-              <w:jc w:val="both"/>
-              <w:rPr>
-                <w:rFonts w:hint="default" w:ascii="Times New Roman" w:hAnsi="Times New Roman"/>
-                <w:sz w:val="22"/>
-                <w:szCs w:val="22"/>
-                <w:lang w:val="en-US"/>
-              </w:rPr>
-            </w:pPr>
-            <w:r>
-              <w:rPr>
-                <w:rFonts w:hint="default" w:ascii="Times New Roman" w:hAnsi="Times New Roman"/>
-                <w:sz w:val="22"/>
-                <w:szCs w:val="22"/>
-                <w:lang w:val="en-US"/>
-              </w:rPr>
-              <w:t>12345</w:t>
-            </w:r>
-          </w:p>
-        </w:tc>
-        <w:tc>
-          <w:tcPr>
-            <w:tcW w:w="1544" w:type="dxa"/>
-          </w:tcPr>
-          <w:p>
-            <w:pPr>
-              <w:numPr>
-                <w:numId w:val="0"/>
-              </w:numPr>
-              <w:spacing w:line="360" w:lineRule="auto"/>
-              <w:jc w:val="both"/>
-              <w:rPr>
-                <w:rFonts w:hint="default" w:ascii="Times New Roman" w:hAnsi="Times New Roman"/>
-                <w:sz w:val="22"/>
-                <w:szCs w:val="22"/>
-                <w:vertAlign w:val="baseline"/>
-                <w:lang w:val="en-US"/>
-              </w:rPr>
-            </w:pPr>
-            <w:r>
-              <w:rPr>
-                <w:rFonts w:hint="default" w:ascii="Times New Roman" w:hAnsi="Times New Roman"/>
-                <w:sz w:val="22"/>
-                <w:szCs w:val="22"/>
-                <w:lang w:val="en-US"/>
-              </w:rPr>
-              <w:t>Too short</w:t>
-            </w:r>
-          </w:p>
-        </w:tc>
-        <w:tc>
-          <w:tcPr>
-            <w:tcW w:w="4980" w:type="dxa"/>
-          </w:tcPr>
-          <w:p>
-            <w:pPr>
-              <w:numPr>
-                <w:numId w:val="0"/>
-              </w:numPr>
-              <w:spacing w:line="360" w:lineRule="auto"/>
-              <w:jc w:val="both"/>
-              <w:rPr>
-                <w:rFonts w:hint="default" w:ascii="Times New Roman" w:hAnsi="Times New Roman"/>
-                <w:sz w:val="22"/>
-                <w:szCs w:val="22"/>
-                <w:vertAlign w:val="baseline"/>
-                <w:lang w:val="en-US"/>
-              </w:rPr>
-            </w:pPr>
-            <w:r>
-              <w:rPr>
-                <w:rFonts w:hint="default" w:ascii="Times New Roman" w:hAnsi="Times New Roman"/>
-                <w:sz w:val="22"/>
-                <w:szCs w:val="22"/>
-                <w:lang w:val="en-US"/>
-              </w:rPr>
-              <w:t>Too short</w:t>
-            </w:r>
-          </w:p>
-        </w:tc>
-      </w:tr>
-      <w:tr>
-        <w:tblPrEx>
-          <w:tblBorders>
-            <w:top w:val="single" w:color="auto" w:sz="4" w:space="0"/>
-            <w:left w:val="single" w:color="auto" w:sz="4" w:space="0"/>
-            <w:bottom w:val="single" w:color="auto" w:sz="4" w:space="0"/>
-            <w:right w:val="single" w:color="auto" w:sz="4" w:space="0"/>
-            <w:insideH w:val="single" w:color="auto" w:sz="4" w:space="0"/>
-            <w:insideV w:val="single" w:color="auto" w:sz="4" w:space="0"/>
-          </w:tblBorders>
-          <w:tblCellMar>
-            <w:left w:w="108" w:type="dxa"/>
-            <w:right w:w="108" w:type="dxa"/>
-          </w:tblCellMar>
-        </w:tblPrEx>
-        <w:tc>
-          <w:tcPr>
-            <w:tcW w:w="1998" w:type="dxa"/>
-          </w:tcPr>
-          <w:p>
-            <w:pPr>
-              <w:numPr>
-                <w:numId w:val="0"/>
-              </w:numPr>
-              <w:spacing w:line="360" w:lineRule="auto"/>
-              <w:jc w:val="both"/>
-              <w:rPr>
-                <w:rFonts w:hint="default" w:ascii="Times New Roman" w:hAnsi="Times New Roman"/>
-                <w:sz w:val="22"/>
-                <w:szCs w:val="22"/>
-                <w:lang w:val="en-US"/>
-              </w:rPr>
-            </w:pPr>
-            <w:r>
-              <w:rPr>
-                <w:rFonts w:hint="default" w:ascii="Times New Roman" w:hAnsi="Times New Roman"/>
-                <w:sz w:val="22"/>
-                <w:szCs w:val="22"/>
-                <w:lang w:val="en-US"/>
-              </w:rPr>
-              <w:t>091122334455</w:t>
-            </w:r>
-          </w:p>
-        </w:tc>
-        <w:tc>
-          <w:tcPr>
-            <w:tcW w:w="1544" w:type="dxa"/>
-          </w:tcPr>
-          <w:p>
-            <w:pPr>
-              <w:numPr>
-                <w:numId w:val="0"/>
-              </w:numPr>
-              <w:spacing w:line="360" w:lineRule="auto"/>
-              <w:jc w:val="both"/>
-              <w:rPr>
-                <w:rFonts w:hint="default" w:ascii="Times New Roman" w:hAnsi="Times New Roman"/>
-                <w:sz w:val="22"/>
-                <w:szCs w:val="22"/>
-                <w:vertAlign w:val="baseline"/>
-                <w:lang w:val="en-US"/>
-              </w:rPr>
-            </w:pPr>
-            <w:r>
-              <w:rPr>
-                <w:rFonts w:hint="default" w:ascii="Times New Roman" w:hAnsi="Times New Roman"/>
-                <w:sz w:val="22"/>
-                <w:szCs w:val="22"/>
-                <w:lang w:val="en-US"/>
-              </w:rPr>
-              <w:t>No</w:t>
-            </w:r>
-          </w:p>
-        </w:tc>
-        <w:tc>
-          <w:tcPr>
-            <w:tcW w:w="4980" w:type="dxa"/>
-          </w:tcPr>
-          <w:p>
-            <w:pPr>
-              <w:numPr>
-                <w:numId w:val="0"/>
-              </w:numPr>
-              <w:spacing w:line="360" w:lineRule="auto"/>
-              <w:jc w:val="both"/>
-              <w:rPr>
-                <w:rFonts w:hint="default" w:ascii="Times New Roman" w:hAnsi="Times New Roman"/>
-                <w:sz w:val="22"/>
-                <w:szCs w:val="22"/>
-                <w:vertAlign w:val="baseline"/>
-                <w:lang w:val="en-US"/>
-              </w:rPr>
-            </w:pPr>
-            <w:r>
-              <w:rPr>
-                <w:rFonts w:hint="default" w:ascii="Times New Roman" w:hAnsi="Times New Roman"/>
-                <w:sz w:val="22"/>
-                <w:szCs w:val="22"/>
-                <w:lang w:val="en-US"/>
-              </w:rPr>
-              <w:t>Too long</w:t>
-            </w:r>
-          </w:p>
-        </w:tc>
-      </w:tr>
-    </w:tbl>
-    <w:p>
-      <w:pPr>
-        <w:numPr>
-          <w:numId w:val="0"/>
-        </w:numPr>
-        <w:spacing w:line="360" w:lineRule="auto"/>
-        <w:jc w:val="both"/>
-        <w:rPr>
-          <w:rFonts w:hint="default" w:ascii="Times New Roman" w:hAnsi="Times New Roman" w:cs="Times New Roman"/>
-          <w:sz w:val="22"/>
-          <w:szCs w:val="22"/>
-          <w:lang w:val="en-US"/>
-        </w:rPr>
-      </w:pPr>
+          <w:rFonts w:hint="default" w:ascii="Times New Roman" w:hAnsi="Times New Roman" w:cs="Times New Roman"/>
+          <w:sz w:val="22"/>
+          <w:szCs w:val="22"/>
+          <w:lang w:val="en-US"/>
+        </w:rPr>
+      </w:pPr>
+      <w:r>
+        <w:rPr>
+          <w:rFonts w:hint="default" w:ascii="Times New Roman" w:hAnsi="Times New Roman" w:cs="Times New Roman"/>
+          <w:sz w:val="22"/>
+          <w:szCs w:val="22"/>
+          <w:lang w:val="en-US"/>
+        </w:rPr>
+        <w:t>Tsion Moges</w:t>
+      </w:r>
+      <w:r>
+        <w:rPr>
+          <w:rFonts w:hint="default" w:ascii="Times New Roman" w:hAnsi="Times New Roman" w:cs="Times New Roman"/>
+          <w:sz w:val="22"/>
+          <w:szCs w:val="22"/>
+          <w:lang w:val="en-US"/>
+        </w:rPr>
+        <w:br w:type="textWrapping"/>
+      </w:r>
+      <w:r>
+        <w:rPr>
+          <w:rFonts w:hint="default" w:ascii="Times New Roman" w:hAnsi="Times New Roman" w:cs="Times New Roman"/>
+          <w:sz w:val="22"/>
+          <w:szCs w:val="22"/>
+          <w:lang w:val="en-US"/>
+        </w:rPr>
+        <w:t>Junior It Application Officer</w:t>
+      </w:r>
     </w:p>
     <w:sectPr>
       <w:pgSz w:w="11906" w:h="16838"/>
@@ -2246,7 +1477,7 @@
     <w:lsdException w:unhideWhenUsed="0" w:uiPriority="0" w:semiHidden="0" w:name="Table Web 2"/>
     <w:lsdException w:unhideWhenUsed="0" w:uiPriority="0" w:semiHidden="0" w:name="Table Web 3"/>
     <w:lsdException w:unhideWhenUsed="0" w:uiPriority="0" w:semiHidden="0" w:name="Balloon Text"/>
-    <w:lsdException w:unhideWhenUsed="0" w:uiPriority="0" w:semiHidden="0" w:name="Table Grid"/>
+    <w:lsdException w:qFormat="1" w:unhideWhenUsed="0" w:uiPriority="0" w:semiHidden="0" w:name="Table Grid"/>
     <w:lsdException w:unhideWhenUsed="0" w:uiPriority="0" w:semiHidden="0" w:name="Table Theme"/>
     <w:lsdException w:unhideWhenUsed="0" w:uiPriority="60" w:semiHidden="0" w:name="Light Shading"/>
     <w:lsdException w:unhideWhenUsed="0" w:uiPriority="61" w:semiHidden="0" w:name="Light List"/>
@@ -2377,6 +1608,7 @@
   <w:style w:type="table" w:styleId="4">
     <w:name w:val="Table Grid"/>
     <w:basedOn w:val="3"/>
+    <w:qFormat/>
     <w:uiPriority w:val="0"/>
     <w:pPr>
       <w:widowControl w:val="0"/>

</xml_diff>